<commit_message>
Mark playbook as Version 1.0
Co-authored-by: Veni Vidi Vici <VeniVidiViciLA@users.noreply.github.com>
</commit_message>
<xml_diff>
--- a/downloads/AI_Safety_Playbook.docx
+++ b/downloads/AI_Safety_Playbook.docx
@@ -82,7 +82,7 @@
                 <w:color w:val="FFFFFF"/>
                 <w:sz w:val="21"/>
               </w:rPr>
-              <w:t>By Emmanuel Diserbeau · Version 1.0 (draft) · October 2026</w:t>
+              <w:t>By Emmanuel Diserbeau · Version 1.0 · October 2026</w:t>
             </w:r>
           </w:p>
         </w:tc>
@@ -8652,7 +8652,7 @@
           <w:i/>
           <w:color w:val="5B6770"/>
         </w:rPr>
-        <w:t>AI Safety Playbook for Small Businesses, v1.0 (draft), by Emmanuel Diserbeau. Licensed under CC BY 4.0 (</w:t>
+        <w:t>AI Safety Playbook for Small Businesses, v1.0, by Emmanuel Diserbeau. Licensed under CC BY 4.0 (</w:t>
       </w:r>
       <w:hyperlink r:id="rId10">
         <w:r>
@@ -8704,7 +8704,7 @@
         <w:color w:val="5B6770"/>
         <w:sz w:val="17"/>
       </w:rPr>
-      <w:t xml:space="preserve">AI Safety Playbook for Small Businesses  ·  v1.0 draft  ·  Not legal advice  ·  Page </w:t>
+      <w:t xml:space="preserve">AI Safety Playbook for Small Businesses  ·  v1.0  ·  Not legal advice  ·  Page </w:t>
     </w:r>
     <w:r>
       <w:rPr>

</xml_diff>